<commit_message>
lab 5 and other updates
</commit_message>
<xml_diff>
--- a/labs/w4/working/final/Lab 4 -Creating Dashboards in Tableau_eamonn_kelly_v3.docx
+++ b/labs/w4/working/final/Lab 4 -Creating Dashboards in Tableau_eamonn_kelly_v3.docx
@@ -1427,6 +1427,13 @@
     </w:p>
     <w:p/>
     <w:p>
+      <w:pPr>
+        <w:pStyle w:val="ListParagraph"/>
+        <w:numPr>
+          <w:ilvl w:val="0"/>
+          <w:numId w:val="8"/>
+        </w:numPr>
+      </w:pPr>
       <w:r>
         <w:t>Available on public Tableau here</w:t>
       </w:r>
@@ -1685,7 +1692,7 @@
   <w:abstractNum w:abstractNumId="2" w15:restartNumberingAfterBreak="0">
     <w:nsid w:val="2D141468"/>
     <w:multiLevelType w:val="hybridMultilevel"/>
-    <w:tmpl w:val="18AA99A8"/>
+    <w:tmpl w:val="28B8A1A4"/>
     <w:lvl w:ilvl="0" w:tplc="08090001">
       <w:start w:val="1"/>
       <w:numFmt w:val="bullet"/>

</xml_diff>